<commit_message>
Fix pun to 'Relativistic, my arse' and add Tabitha payoff beat
Changed 'holistic' to 'relativistic' -- a much sharper joke given the book's
entire premise, and 'Relativistic, my arse' now echoes the book's own title
directly from the mother's mouth.

Added the payoff beat at the Tabitha clock scene, right after Derek admits
he's more comfortable with her presence than without it: he goes to file
this under 'Processed' from habit, same as he did with the divorce, but
notices the drawer won't close properly this time -- completing the
thematic link between his personal 'filing error' and the case's central
metaphor (something pending, mislabeled as closed).

Co-Authored-By: Claude Sonnet 5 <noreply@anthropic.com>
</commit_message>
<xml_diff>
--- a/The Relativistic Investigation Bureau - SERIES/FINAL_REV10_The_Murder_That_Hadnt_Happened_Yet_KINDLE_READY.docx
+++ b/The Relativistic Investigation Bureau - SERIES/FINAL_REV10_The_Murder_That_Hadnt_Happened_Yet_KINDLE_READY.docx
@@ -1539,7 +1539,7 @@
       <w:bookmarkEnd w:id="55"/>
       <w:r>
         <w:rPr/>
-        <w:t xml:space="preserve">He had a sister, Tabitha, who was generally considered the more dangerous of the two, a fact Trevor mentioned only when cornered, and sometimes not even then. Derek, for his part, had Sophie - twelve, precise, already suspicious of adult explanations - currently at school, which was supposed to be the safest sentence in London. Sophie's mother had left three years earlier, for a man named Julian who had made an improbable fortune manufacturing clothes hangers and bore, Derek privately maintained, a distracting resemblance to Hugh Grant in his more apologetic period. She had told him, with the specific clarity she reserved for important announcements, that he did not make enough money for her needs - a diagnosis Derek found difficult to dispute, given that the Bureau's ordinary cases paid terribly and its unusual ones paid worse. When Derek had attempted to point out that the Bureau offered a more holistic kind of reward, she had considered this for exactly as long as it deserved. "Holistic, my arse," she said, and was gone by Thursday. Derek had filed the entire matter under Processed - Do Not Reopen, which worked well enough, most days.</w:t>
+        <w:t xml:space="preserve">He had a sister, Tabitha, who was generally considered the more dangerous of the two, a fact Trevor mentioned only when cornered, and sometimes not even then. Derek, for his part, had Sophie - twelve, precise, already suspicious of adult explanations - currently at school, which was supposed to be the safest sentence in London. Sophie's mother had left three years earlier, for a man named Julian who had made an improbable fortune manufacturing clothes hangers and bore, Derek privately maintained, a distracting resemblance to Hugh Grant in his more apologetic period. She had told him, with the specific clarity she reserved for important announcements, that he did not make enough money for her needs - a diagnosis Derek found difficult to dispute, given that the Bureau's ordinary cases paid terribly and its unusual ones paid worse. When Derek had attempted to point out that the Bureau offered a more relativistic kind of reward, she had considered this for exactly as long as it deserved. "Relativistic, my arse," she said, and was gone by Thursday. Derek had filed the entire matter under Processed - Do Not Reopen, which worked well enough, most days.</w:t>
       </w:r>
     </w:p>
     <w:p>
@@ -42495,6 +42495,12 @@
         <w:t xml:space="preserve">Derek discovered he was not entirely sorry. The realisation that he was more comfortable with her presence than without it was, he concluded, going to be a problem for another day - preferably one that had not yet been invented. </w:t>
       </w:r>
       <w:bookmarkEnd w:id="5563"/>
+    </w:p>
+    <w:p>
+      <w:r>
+        <w:rPr/>
+        <w:t xml:space="preserve">He filed this under Processed as well, from long habit, before noticing that the drawer no longer seemed to close properly. It occurred to him, distantly, that some cases got reopened not because new evidence arrived, but because someone finally looked at the label twice.</w:t>
+      </w:r>
     </w:p>
     <w:p>
       <w:bookmarkStart w:id="5564" w:name="He_suspected_it_would_not_remain"/>

</xml_diff>